<commit_message>
Align three-worker rollout and go-live proof
</commit_message>
<xml_diff>
--- a/portal/public/downloads/ADVANCED-CAPABILITY-AND-TRAINER-SKILLS-GUIDE-v5-PUBLIC-KIT.docx
+++ b/portal/public/downloads/ADVANCED-CAPABILITY-AND-TRAINER-SKILLS-GUIDE-v5-PUBLIC-KIT.docx
@@ -2087,6 +2087,78 @@
         <w:t>Protected release: https://github.com/kairali-digital/ai-human-workspace/releases/tag/v1.5.0</w:t>
       </w:r>
     </w:p>
+    <w:tbl>
+      <w:tblPr>
+        <w:tblW w:type="dxa" w:w="9360"/>
+        <w:jc w:val="left"/>
+        <w:tblLayout w:type="fixed"/>
+        <w:tblLook w:firstColumn="1" w:firstRow="1" w:lastColumn="0" w:lastRow="0" w:noHBand="0" w:noVBand="1" w:val="04A0"/>
+      </w:tblPr>
+      <w:tblGrid>
+        <w:gridCol w:w="1850"/>
+        <w:gridCol w:w="7510"/>
+      </w:tblGrid>
+      <w:tr>
+        <w:trPr>
+          <w:tblHeader w:val="true"/>
+        </w:trPr>
+        <w:tc>
+          <w:tcPr>
+            <w:tcW w:type="dxa" w:w="1850"/>
+            <w:tcMar>
+              <w:top w:w="100" w:type="dxa"/>
+              <w:start w:w="130" w:type="dxa"/>
+              <w:bottom w:w="100" w:type="dxa"/>
+              <w:end w:w="130" w:type="dxa"/>
+            </w:tcMar>
+            <w:shd w:fill="E3EEF2"/>
+            <w:vAlign w:val="center"/>
+          </w:tcPr>
+          <w:p>
+            <w:r>
+              <w:rPr>
+                <w:rFonts w:ascii="Arial" w:hAnsi="Arial"/>
+                <w:b/>
+                <w:i w:val="0"/>
+                <w:color w:val="2D713D"/>
+                <w:sz w:val="18"/>
+              </w:rPr>
+              <w:t>THREE-WORKER LIVE CHECK</w:t>
+            </w:r>
+          </w:p>
+        </w:tc>
+        <w:tc>
+          <w:tcPr>
+            <w:tcW w:type="dxa" w:w="7510"/>
+            <w:tcMar>
+              <w:top w:w="100" w:type="dxa"/>
+              <w:start w:w="130" w:type="dxa"/>
+              <w:bottom w:w="100" w:type="dxa"/>
+              <w:end w:w="130" w:type="dxa"/>
+            </w:tcMar>
+            <w:shd w:fill="E3EEF2"/>
+            <w:vAlign w:val="center"/>
+          </w:tcPr>
+          <w:p>
+            <w:r>
+              <w:rPr>
+                <w:rFonts w:ascii="Arial" w:hAnsi="Arial"/>
+                <w:b w:val="0"/>
+                <w:i w:val="0"/>
+                <w:color w:val="173428"/>
+                <w:sz w:val="18"/>
+              </w:rPr>
+              <w:t>The public kit makes Email, Full Drive Index and optional Saturday LinkedIn available. Employee activation still needs the named account, schedule, permission and local proof. TEST 25 is Drive setup only; declined LinkedIn is NOT ENABLED BY CHOICE.</w:t>
+            </w:r>
+          </w:p>
+        </w:tc>
+      </w:tr>
+    </w:tbl>
+    <w:p>
+      <w:pPr>
+        <w:spacing w:after="40"/>
+      </w:pPr>
+    </w:p>
     <w:sectPr>
       <w:headerReference w:type="default" r:id="rId9"/>
       <w:footerReference w:type="default" r:id="rId10"/>

</xml_diff>